<commit_message>
fix(informe_tecnico): Corregir SVG sin superposiciones y completar listas de índices
- Rediseñar estructura_directorios.svg con mejor espaciado y sin superposiciones
- Rediseñar ciclo_vida_aplicacion.svg con tildes correctas y sin cruces
- Implementar lista de ilustraciones completa (15 figuras)
- Implementar lista de tablas completa (10 tablas)
- Corregir tildes: básicos, Postulación, corrección, DOCUMENTACIÓN, REVISIÓN, DECISIÓN
- Regenerar documento completo (1.2MB)
</commit_message>
<xml_diff>
--- a/docs/informe_tecnico/output/INFORME_TECNICO_PLUGINS_ISER_2025.docx
+++ b/docs/informe_tecnico/output/INFORME_TECNICO_PLUGINS_ISER_2025.docx
@@ -250,7 +250,7 @@
         <w:rPr>
           <w:b/>
           <w:bCs/>
-          <w:color w:val="EB4335"/>
+          <w:color w:val="1B9E88"/>
           <w:sz w:val="28"/>
           <w:szCs w:val="28"/>
           <w:caps/>
@@ -261,19 +261,795 @@
     </w:p>
     <w:p>
       <w:pPr>
-        <w:spacing w:before="200" w:after="400"/>
-        <w:jc w:val="center"/>
+        <w:pBdr>
+          <w:bottom w:val="single" w:color="1B9E88" w:sz="8" w:space="1"/>
+        </w:pBdr>
+        <w:tabs>
+          <w:tab w:val="left" w:pos="1200"/>
+          <w:tab w:val="right" w:pos="9000"/>
+        </w:tabs>
+        <w:spacing w:before="200" w:after="150"/>
+      </w:pPr>
+      <w:r>
+        <w:rPr>
+          <w:b/>
+          <w:bCs/>
+          <w:sz w:val="22"/>
+          <w:szCs w:val="22"/>
+          <w:rFonts w:ascii="Arial" w:cs="Arial" w:eastAsia="Arial" w:hAnsi="Arial"/>
+        </w:rPr>
+        <w:t xml:space="preserve">Figura</w:t>
+      </w:r>
+      <w:r>
+        <w:rPr>
+          <w:sz w:val="22"/>
+          <w:szCs w:val="22"/>
+        </w:rPr>
+        <w:t xml:space="preserve">	</w:t>
+      </w:r>
+      <w:r>
+        <w:rPr>
+          <w:b/>
+          <w:bCs/>
+          <w:sz w:val="22"/>
+          <w:szCs w:val="22"/>
+          <w:rFonts w:ascii="Arial" w:cs="Arial" w:eastAsia="Arial" w:hAnsi="Arial"/>
+        </w:rPr>
+        <w:t xml:space="preserve">Título</w:t>
+      </w:r>
+      <w:r>
+        <w:rPr>
+          <w:sz w:val="22"/>
+          <w:szCs w:val="22"/>
+        </w:rPr>
+        <w:t xml:space="preserve">	</w:t>
+      </w:r>
+      <w:r>
+        <w:rPr>
+          <w:b/>
+          <w:bCs/>
+          <w:sz w:val="22"/>
+          <w:szCs w:val="22"/>
+          <w:rFonts w:ascii="Arial" w:cs="Arial" w:eastAsia="Arial" w:hAnsi="Arial"/>
+        </w:rPr>
+        <w:t xml:space="preserve">Pág.</w:t>
+      </w:r>
+    </w:p>
+    <w:p>
+      <w:pPr>
+        <w:tabs>
+          <w:tab w:val="left" w:pos="1200"/>
+          <w:tab w:val="right" w:pos="9000" w:leader="dot"/>
+        </w:tabs>
+        <w:spacing w:before="80" w:after="80"/>
+      </w:pPr>
+      <w:r>
+        <w:rPr>
+          <w:color w:val="1B9E88"/>
+          <w:sz w:val="22"/>
+          <w:szCs w:val="22"/>
+          <w:rFonts w:ascii="Arial" w:cs="Arial" w:eastAsia="Arial" w:hAnsi="Arial"/>
+        </w:rPr>
+        <w:t xml:space="preserve">Figura 1</w:t>
+      </w:r>
+      <w:r>
+        <w:rPr>
+          <w:sz w:val="22"/>
+          <w:szCs w:val="22"/>
+        </w:rPr>
+        <w:t xml:space="preserve">	</w:t>
+      </w:r>
+      <w:r>
+        <w:rPr>
+          <w:sz w:val="22"/>
+          <w:szCs w:val="22"/>
+          <w:rFonts w:ascii="Arial" w:cs="Arial" w:eastAsia="Arial" w:hAnsi="Arial"/>
+        </w:rPr>
+        <w:t xml:space="preserve">Estructura de directorios del plugin local_jobboard</w:t>
+      </w:r>
+      <w:r>
+        <w:rPr>
+          <w:sz w:val="22"/>
+          <w:szCs w:val="22"/>
+        </w:rPr>
+        <w:t xml:space="preserve">	</w:t>
+      </w:r>
+      <w:r>
+        <w:rPr>
+          <w:sz w:val="22"/>
+          <w:szCs w:val="22"/>
+          <w:rFonts w:ascii="Arial" w:cs="Arial" w:eastAsia="Arial" w:hAnsi="Arial"/>
+        </w:rPr>
+        <w:t xml:space="preserve">8</w:t>
+      </w:r>
+    </w:p>
+    <w:p>
+      <w:pPr>
+        <w:tabs>
+          <w:tab w:val="left" w:pos="1200"/>
+          <w:tab w:val="right" w:pos="9000" w:leader="dot"/>
+        </w:tabs>
+        <w:spacing w:before="80" w:after="80"/>
+      </w:pPr>
+      <w:r>
+        <w:rPr>
+          <w:color w:val="1B9E88"/>
+          <w:sz w:val="22"/>
+          <w:szCs w:val="22"/>
+          <w:rFonts w:ascii="Arial" w:cs="Arial" w:eastAsia="Arial" w:hAnsi="Arial"/>
+        </w:rPr>
+        <w:t xml:space="preserve">Figura 2</w:t>
+      </w:r>
+      <w:r>
+        <w:rPr>
+          <w:sz w:val="22"/>
+          <w:szCs w:val="22"/>
+        </w:rPr>
+        <w:t xml:space="preserve">	</w:t>
+      </w:r>
+      <w:r>
+        <w:rPr>
+          <w:sz w:val="22"/>
+          <w:szCs w:val="22"/>
+          <w:rFonts w:ascii="Arial" w:cs="Arial" w:eastAsia="Arial" w:hAnsi="Arial"/>
+        </w:rPr>
+        <w:t xml:space="preserve">Arquitectura del plugin local_jobboard</w:t>
+      </w:r>
+      <w:r>
+        <w:rPr>
+          <w:sz w:val="22"/>
+          <w:szCs w:val="22"/>
+        </w:rPr>
+        <w:t xml:space="preserve">	</w:t>
+      </w:r>
+      <w:r>
+        <w:rPr>
+          <w:sz w:val="22"/>
+          <w:szCs w:val="22"/>
+          <w:rFonts w:ascii="Arial" w:cs="Arial" w:eastAsia="Arial" w:hAnsi="Arial"/>
+        </w:rPr>
+        <w:t xml:space="preserve">9</w:t>
+      </w:r>
+    </w:p>
+    <w:p>
+      <w:pPr>
+        <w:tabs>
+          <w:tab w:val="left" w:pos="1200"/>
+          <w:tab w:val="right" w:pos="9000" w:leader="dot"/>
+        </w:tabs>
+        <w:spacing w:before="80" w:after="80"/>
+      </w:pPr>
+      <w:r>
+        <w:rPr>
+          <w:color w:val="1B9E88"/>
+          <w:sz w:val="22"/>
+          <w:szCs w:val="22"/>
+          <w:rFonts w:ascii="Arial" w:cs="Arial" w:eastAsia="Arial" w:hAnsi="Arial"/>
+        </w:rPr>
+        <w:t xml:space="preserve">Figura 3</w:t>
+      </w:r>
+      <w:r>
+        <w:rPr>
+          <w:sz w:val="22"/>
+          <w:szCs w:val="22"/>
+        </w:rPr>
+        <w:t xml:space="preserve">	</w:t>
+      </w:r>
+      <w:r>
+        <w:rPr>
+          <w:sz w:val="22"/>
+          <w:szCs w:val="22"/>
+          <w:rFonts w:ascii="Arial" w:cs="Arial" w:eastAsia="Arial" w:hAnsi="Arial"/>
+        </w:rPr>
+        <w:t xml:space="preserve">Diagrama de casos de uso</w:t>
+      </w:r>
+      <w:r>
+        <w:rPr>
+          <w:sz w:val="22"/>
+          <w:szCs w:val="22"/>
+        </w:rPr>
+        <w:t xml:space="preserve">	</w:t>
+      </w:r>
+      <w:r>
+        <w:rPr>
+          <w:sz w:val="22"/>
+          <w:szCs w:val="22"/>
+          <w:rFonts w:ascii="Arial" w:cs="Arial" w:eastAsia="Arial" w:hAnsi="Arial"/>
+        </w:rPr>
+        <w:t xml:space="preserve">10</w:t>
+      </w:r>
+    </w:p>
+    <w:p>
+      <w:pPr>
+        <w:tabs>
+          <w:tab w:val="left" w:pos="1200"/>
+          <w:tab w:val="right" w:pos="9000" w:leader="dot"/>
+        </w:tabs>
+        <w:spacing w:before="80" w:after="80"/>
+      </w:pPr>
+      <w:r>
+        <w:rPr>
+          <w:color w:val="1B9E88"/>
+          <w:sz w:val="22"/>
+          <w:szCs w:val="22"/>
+          <w:rFonts w:ascii="Arial" w:cs="Arial" w:eastAsia="Arial" w:hAnsi="Arial"/>
+        </w:rPr>
+        <w:t xml:space="preserve">Figura 4</w:t>
+      </w:r>
+      <w:r>
+        <w:rPr>
+          <w:sz w:val="22"/>
+          <w:szCs w:val="22"/>
+        </w:rPr>
+        <w:t xml:space="preserve">	</w:t>
+      </w:r>
+      <w:r>
+        <w:rPr>
+          <w:sz w:val="22"/>
+          <w:szCs w:val="22"/>
+          <w:rFonts w:ascii="Arial" w:cs="Arial" w:eastAsia="Arial" w:hAnsi="Arial"/>
+        </w:rPr>
+        <w:t xml:space="preserve">Diagrama entidad-relación del plugin local_jobboard</w:t>
+      </w:r>
+      <w:r>
+        <w:rPr>
+          <w:sz w:val="22"/>
+          <w:szCs w:val="22"/>
+        </w:rPr>
+        <w:t xml:space="preserve">	</w:t>
+      </w:r>
+      <w:r>
+        <w:rPr>
+          <w:sz w:val="22"/>
+          <w:szCs w:val="22"/>
+          <w:rFonts w:ascii="Arial" w:cs="Arial" w:eastAsia="Arial" w:hAnsi="Arial"/>
+        </w:rPr>
+        <w:t xml:space="preserve">12</w:t>
+      </w:r>
+    </w:p>
+    <w:p>
+      <w:pPr>
+        <w:tabs>
+          <w:tab w:val="left" w:pos="1200"/>
+          <w:tab w:val="right" w:pos="9000" w:leader="dot"/>
+        </w:tabs>
+        <w:spacing w:before="80" w:after="80"/>
+      </w:pPr>
+      <w:r>
+        <w:rPr>
+          <w:color w:val="1B9E88"/>
+          <w:sz w:val="22"/>
+          <w:szCs w:val="22"/>
+          <w:rFonts w:ascii="Arial" w:cs="Arial" w:eastAsia="Arial" w:hAnsi="Arial"/>
+        </w:rPr>
+        <w:t xml:space="preserve">Figura 5</w:t>
+      </w:r>
+      <w:r>
+        <w:rPr>
+          <w:sz w:val="22"/>
+          <w:szCs w:val="22"/>
+        </w:rPr>
+        <w:t xml:space="preserve">	</w:t>
+      </w:r>
+      <w:r>
+        <w:rPr>
+          <w:sz w:val="22"/>
+          <w:szCs w:val="22"/>
+          <w:rFonts w:ascii="Arial" w:cs="Arial" w:eastAsia="Arial" w:hAnsi="Arial"/>
+        </w:rPr>
+        <w:t xml:space="preserve">Diagrama de clases principales</w:t>
+      </w:r>
+      <w:r>
+        <w:rPr>
+          <w:sz w:val="22"/>
+          <w:szCs w:val="22"/>
+        </w:rPr>
+        <w:t xml:space="preserve">	</w:t>
+      </w:r>
+      <w:r>
+        <w:rPr>
+          <w:sz w:val="22"/>
+          <w:szCs w:val="22"/>
+          <w:rFonts w:ascii="Arial" w:cs="Arial" w:eastAsia="Arial" w:hAnsi="Arial"/>
+        </w:rPr>
+        <w:t xml:space="preserve">14</w:t>
+      </w:r>
+    </w:p>
+    <w:p>
+      <w:pPr>
+        <w:tabs>
+          <w:tab w:val="left" w:pos="1200"/>
+          <w:tab w:val="right" w:pos="9000" w:leader="dot"/>
+        </w:tabs>
+        <w:spacing w:before="80" w:after="80"/>
+      </w:pPr>
+      <w:r>
+        <w:rPr>
+          <w:color w:val="1B9E88"/>
+          <w:sz w:val="22"/>
+          <w:szCs w:val="22"/>
+          <w:rFonts w:ascii="Arial" w:cs="Arial" w:eastAsia="Arial" w:hAnsi="Arial"/>
+        </w:rPr>
+        <w:t xml:space="preserve">Figura 6</w:t>
+      </w:r>
+      <w:r>
+        <w:rPr>
+          <w:sz w:val="22"/>
+          <w:szCs w:val="22"/>
+        </w:rPr>
+        <w:t xml:space="preserve">	</w:t>
+      </w:r>
+      <w:r>
+        <w:rPr>
+          <w:sz w:val="22"/>
+          <w:szCs w:val="22"/>
+          <w:rFonts w:ascii="Arial" w:cs="Arial" w:eastAsia="Arial" w:hAnsi="Arial"/>
+        </w:rPr>
+        <w:t xml:space="preserve">Servicios web disponibles</w:t>
+      </w:r>
+      <w:r>
+        <w:rPr>
+          <w:sz w:val="22"/>
+          <w:szCs w:val="22"/>
+        </w:rPr>
+        <w:t xml:space="preserve">	</w:t>
+      </w:r>
+      <w:r>
+        <w:rPr>
+          <w:sz w:val="22"/>
+          <w:szCs w:val="22"/>
+          <w:rFonts w:ascii="Arial" w:cs="Arial" w:eastAsia="Arial" w:hAnsi="Arial"/>
+        </w:rPr>
+        <w:t xml:space="preserve">16</w:t>
+      </w:r>
+    </w:p>
+    <w:p>
+      <w:pPr>
+        <w:tabs>
+          <w:tab w:val="left" w:pos="1200"/>
+          <w:tab w:val="right" w:pos="9000" w:leader="dot"/>
+        </w:tabs>
+        <w:spacing w:before="80" w:after="80"/>
+      </w:pPr>
+      <w:r>
+        <w:rPr>
+          <w:color w:val="1B9E88"/>
+          <w:sz w:val="22"/>
+          <w:szCs w:val="22"/>
+          <w:rFonts w:ascii="Arial" w:cs="Arial" w:eastAsia="Arial" w:hAnsi="Arial"/>
+        </w:rPr>
+        <w:t xml:space="preserve">Figura 7</w:t>
+      </w:r>
+      <w:r>
+        <w:rPr>
+          <w:sz w:val="22"/>
+          <w:szCs w:val="22"/>
+        </w:rPr>
+        <w:t xml:space="preserve">	</w:t>
+      </w:r>
+      <w:r>
+        <w:rPr>
+          <w:sz w:val="22"/>
+          <w:szCs w:val="22"/>
+          <w:rFonts w:ascii="Arial" w:cs="Arial" w:eastAsia="Arial" w:hAnsi="Arial"/>
+        </w:rPr>
+        <w:t xml:space="preserve">Flujo de estados de vacante</w:t>
+      </w:r>
+      <w:r>
+        <w:rPr>
+          <w:sz w:val="22"/>
+          <w:szCs w:val="22"/>
+        </w:rPr>
+        <w:t xml:space="preserve">	</w:t>
+      </w:r>
+      <w:r>
+        <w:rPr>
+          <w:sz w:val="22"/>
+          <w:szCs w:val="22"/>
+          <w:rFonts w:ascii="Arial" w:cs="Arial" w:eastAsia="Arial" w:hAnsi="Arial"/>
+        </w:rPr>
+        <w:t xml:space="preserve">18</w:t>
+      </w:r>
+    </w:p>
+    <w:p>
+      <w:pPr>
+        <w:tabs>
+          <w:tab w:val="left" w:pos="1200"/>
+          <w:tab w:val="right" w:pos="9000" w:leader="dot"/>
+        </w:tabs>
+        <w:spacing w:before="80" w:after="80"/>
+      </w:pPr>
+      <w:r>
+        <w:rPr>
+          <w:color w:val="1B9E88"/>
+          <w:sz w:val="22"/>
+          <w:szCs w:val="22"/>
+          <w:rFonts w:ascii="Arial" w:cs="Arial" w:eastAsia="Arial" w:hAnsi="Arial"/>
+        </w:rPr>
+        <w:t xml:space="preserve">Figura 8</w:t>
+      </w:r>
+      <w:r>
+        <w:rPr>
+          <w:sz w:val="22"/>
+          <w:szCs w:val="22"/>
+        </w:rPr>
+        <w:t xml:space="preserve">	</w:t>
+      </w:r>
+      <w:r>
+        <w:rPr>
+          <w:sz w:val="22"/>
+          <w:szCs w:val="22"/>
+          <w:rFonts w:ascii="Arial" w:cs="Arial" w:eastAsia="Arial" w:hAnsi="Arial"/>
+        </w:rPr>
+        <w:t xml:space="preserve">Flujo de postulación</w:t>
+      </w:r>
+      <w:r>
+        <w:rPr>
+          <w:sz w:val="22"/>
+          <w:szCs w:val="22"/>
+        </w:rPr>
+        <w:t xml:space="preserve">	</w:t>
+      </w:r>
+      <w:r>
+        <w:rPr>
+          <w:sz w:val="22"/>
+          <w:szCs w:val="22"/>
+          <w:rFonts w:ascii="Arial" w:cs="Arial" w:eastAsia="Arial" w:hAnsi="Arial"/>
+        </w:rPr>
+        <w:t xml:space="preserve">19</w:t>
+      </w:r>
+    </w:p>
+    <w:p>
+      <w:pPr>
+        <w:tabs>
+          <w:tab w:val="left" w:pos="1200"/>
+          <w:tab w:val="right" w:pos="9000" w:leader="dot"/>
+        </w:tabs>
+        <w:spacing w:before="80" w:after="80"/>
+      </w:pPr>
+      <w:r>
+        <w:rPr>
+          <w:color w:val="1B9E88"/>
+          <w:sz w:val="22"/>
+          <w:szCs w:val="22"/>
+          <w:rFonts w:ascii="Arial" w:cs="Arial" w:eastAsia="Arial" w:hAnsi="Arial"/>
+        </w:rPr>
+        <w:t xml:space="preserve">Figura 9</w:t>
+      </w:r>
+      <w:r>
+        <w:rPr>
+          <w:sz w:val="22"/>
+          <w:szCs w:val="22"/>
+        </w:rPr>
+        <w:t xml:space="preserve">	</w:t>
+      </w:r>
+      <w:r>
+        <w:rPr>
+          <w:sz w:val="22"/>
+          <w:szCs w:val="22"/>
+          <w:rFonts w:ascii="Arial" w:cs="Arial" w:eastAsia="Arial" w:hAnsi="Arial"/>
+        </w:rPr>
+        <w:t xml:space="preserve">Ciclo de vida de la aplicación</w:t>
+      </w:r>
+      <w:r>
+        <w:rPr>
+          <w:sz w:val="22"/>
+          <w:szCs w:val="22"/>
+        </w:rPr>
+        <w:t xml:space="preserve">	</w:t>
+      </w:r>
+      <w:r>
+        <w:rPr>
+          <w:sz w:val="22"/>
+          <w:szCs w:val="22"/>
+          <w:rFonts w:ascii="Arial" w:cs="Arial" w:eastAsia="Arial" w:hAnsi="Arial"/>
+        </w:rPr>
+        <w:t xml:space="preserve">20</w:t>
+      </w:r>
+    </w:p>
+    <w:p>
+      <w:pPr>
+        <w:tabs>
+          <w:tab w:val="left" w:pos="1200"/>
+          <w:tab w:val="right" w:pos="9000" w:leader="dot"/>
+        </w:tabs>
+        <w:spacing w:before="80" w:after="80"/>
+      </w:pPr>
+      <w:r>
+        <w:rPr>
+          <w:color w:val="1B9E88"/>
+          <w:sz w:val="22"/>
+          <w:szCs w:val="22"/>
+          <w:rFonts w:ascii="Arial" w:cs="Arial" w:eastAsia="Arial" w:hAnsi="Arial"/>
+        </w:rPr>
+        <w:t xml:space="preserve">Figura 10</w:t>
+      </w:r>
+      <w:r>
+        <w:rPr>
+          <w:sz w:val="22"/>
+          <w:szCs w:val="22"/>
+        </w:rPr>
+        <w:t xml:space="preserve">	</w:t>
+      </w:r>
+      <w:r>
+        <w:rPr>
+          <w:sz w:val="22"/>
+          <w:szCs w:val="22"/>
+          <w:rFonts w:ascii="Arial" w:cs="Arial" w:eastAsia="Arial" w:hAnsi="Arial"/>
+        </w:rPr>
+        <w:t xml:space="preserve">Estructura de directorios del plugin report_platform_usage</w:t>
+      </w:r>
+      <w:r>
+        <w:rPr>
+          <w:sz w:val="22"/>
+          <w:szCs w:val="22"/>
+        </w:rPr>
+        <w:t xml:space="preserve">	</w:t>
+      </w:r>
+      <w:r>
+        <w:rPr>
+          <w:sz w:val="22"/>
+          <w:szCs w:val="22"/>
+          <w:rFonts w:ascii="Arial" w:cs="Arial" w:eastAsia="Arial" w:hAnsi="Arial"/>
+        </w:rPr>
+        <w:t xml:space="preserve">22</w:t>
+      </w:r>
+    </w:p>
+    <w:p>
+      <w:pPr>
+        <w:tabs>
+          <w:tab w:val="left" w:pos="1200"/>
+          <w:tab w:val="right" w:pos="9000" w:leader="dot"/>
+        </w:tabs>
+        <w:spacing w:before="80" w:after="80"/>
+      </w:pPr>
+      <w:r>
+        <w:rPr>
+          <w:color w:val="1B9E88"/>
+          <w:sz w:val="22"/>
+          <w:szCs w:val="22"/>
+          <w:rFonts w:ascii="Arial" w:cs="Arial" w:eastAsia="Arial" w:hAnsi="Arial"/>
+        </w:rPr>
+        <w:t xml:space="preserve">Figura 11</w:t>
+      </w:r>
+      <w:r>
+        <w:rPr>
+          <w:sz w:val="22"/>
+          <w:szCs w:val="22"/>
+        </w:rPr>
+        <w:t xml:space="preserve">	</w:t>
+      </w:r>
+      <w:r>
+        <w:rPr>
+          <w:sz w:val="22"/>
+          <w:szCs w:val="22"/>
+          <w:rFonts w:ascii="Arial" w:cs="Arial" w:eastAsia="Arial" w:hAnsi="Arial"/>
+        </w:rPr>
+        <w:t xml:space="preserve">Diagrama de arquitectura - Platform Usage Report</w:t>
+      </w:r>
+      <w:r>
+        <w:rPr>
+          <w:sz w:val="22"/>
+          <w:szCs w:val="22"/>
+        </w:rPr>
+        <w:t xml:space="preserve">	</w:t>
+      </w:r>
+      <w:r>
+        <w:rPr>
+          <w:sz w:val="22"/>
+          <w:szCs w:val="22"/>
+          <w:rFonts w:ascii="Arial" w:cs="Arial" w:eastAsia="Arial" w:hAnsi="Arial"/>
+        </w:rPr>
+        <w:t xml:space="preserve">24</w:t>
+      </w:r>
+    </w:p>
+    <w:p>
+      <w:pPr>
+        <w:tabs>
+          <w:tab w:val="left" w:pos="1200"/>
+          <w:tab w:val="right" w:pos="9000" w:leader="dot"/>
+        </w:tabs>
+        <w:spacing w:before="80" w:after="80"/>
+      </w:pPr>
+      <w:r>
+        <w:rPr>
+          <w:color w:val="1B9E88"/>
+          <w:sz w:val="22"/>
+          <w:szCs w:val="22"/>
+          <w:rFonts w:ascii="Arial" w:cs="Arial" w:eastAsia="Arial" w:hAnsi="Arial"/>
+        </w:rPr>
+        <w:t xml:space="preserve">Figura 12</w:t>
+      </w:r>
+      <w:r>
+        <w:rPr>
+          <w:sz w:val="22"/>
+          <w:szCs w:val="22"/>
+        </w:rPr>
+        <w:t xml:space="preserve">	</w:t>
+      </w:r>
+      <w:r>
+        <w:rPr>
+          <w:sz w:val="22"/>
+          <w:szCs w:val="22"/>
+          <w:rFonts w:ascii="Arial" w:cs="Arial" w:eastAsia="Arial" w:hAnsi="Arial"/>
+        </w:rPr>
+        <w:t xml:space="preserve">Diagrama de flujo de datos - Platform Usage Report</w:t>
+      </w:r>
+      <w:r>
+        <w:rPr>
+          <w:sz w:val="22"/>
+          <w:szCs w:val="22"/>
+        </w:rPr>
+        <w:t xml:space="preserve">	</w:t>
+      </w:r>
+      <w:r>
+        <w:rPr>
+          <w:sz w:val="22"/>
+          <w:szCs w:val="22"/>
+          <w:rFonts w:ascii="Arial" w:cs="Arial" w:eastAsia="Arial" w:hAnsi="Arial"/>
+        </w:rPr>
+        <w:t xml:space="preserve">28</w:t>
+      </w:r>
+    </w:p>
+    <w:p>
+      <w:pPr>
+        <w:tabs>
+          <w:tab w:val="left" w:pos="1200"/>
+          <w:tab w:val="right" w:pos="9000" w:leader="dot"/>
+        </w:tabs>
+        <w:spacing w:before="80" w:after="80"/>
+      </w:pPr>
+      <w:r>
+        <w:rPr>
+          <w:color w:val="1B9E88"/>
+          <w:sz w:val="22"/>
+          <w:szCs w:val="22"/>
+          <w:rFonts w:ascii="Arial" w:cs="Arial" w:eastAsia="Arial" w:hAnsi="Arial"/>
+        </w:rPr>
+        <w:t xml:space="preserve">Figura 13</w:t>
+      </w:r>
+      <w:r>
+        <w:rPr>
+          <w:sz w:val="22"/>
+          <w:szCs w:val="22"/>
+        </w:rPr>
+        <w:t xml:space="preserve">	</w:t>
+      </w:r>
+      <w:r>
+        <w:rPr>
+          <w:sz w:val="22"/>
+          <w:szCs w:val="22"/>
+          <w:rFonts w:ascii="Arial" w:cs="Arial" w:eastAsia="Arial" w:hAnsi="Arial"/>
+        </w:rPr>
+        <w:t xml:space="preserve">Estructura de directorios del plugin local_platform_access</w:t>
+      </w:r>
+      <w:r>
+        <w:rPr>
+          <w:sz w:val="22"/>
+          <w:szCs w:val="22"/>
+        </w:rPr>
+        <w:t xml:space="preserve">	</w:t>
+      </w:r>
+      <w:r>
+        <w:rPr>
+          <w:sz w:val="22"/>
+          <w:szCs w:val="22"/>
+          <w:rFonts w:ascii="Arial" w:cs="Arial" w:eastAsia="Arial" w:hAnsi="Arial"/>
+        </w:rPr>
+        <w:t xml:space="preserve">32</w:t>
+      </w:r>
+    </w:p>
+    <w:p>
+      <w:pPr>
+        <w:tabs>
+          <w:tab w:val="left" w:pos="1200"/>
+          <w:tab w:val="right" w:pos="9000" w:leader="dot"/>
+        </w:tabs>
+        <w:spacing w:before="80" w:after="80"/>
+      </w:pPr>
+      <w:r>
+        <w:rPr>
+          <w:color w:val="1B9E88"/>
+          <w:sz w:val="22"/>
+          <w:szCs w:val="22"/>
+          <w:rFonts w:ascii="Arial" w:cs="Arial" w:eastAsia="Arial" w:hAnsi="Arial"/>
+        </w:rPr>
+        <w:t xml:space="preserve">Figura 14</w:t>
+      </w:r>
+      <w:r>
+        <w:rPr>
+          <w:sz w:val="22"/>
+          <w:szCs w:val="22"/>
+        </w:rPr>
+        <w:t xml:space="preserve">	</w:t>
+      </w:r>
+      <w:r>
+        <w:rPr>
+          <w:sz w:val="22"/>
+          <w:szCs w:val="22"/>
+          <w:rFonts w:ascii="Arial" w:cs="Arial" w:eastAsia="Arial" w:hAnsi="Arial"/>
+        </w:rPr>
+        <w:t xml:space="preserve">Diagrama de arquitectura - Platform Access Generator</w:t>
+      </w:r>
+      <w:r>
+        <w:rPr>
+          <w:sz w:val="22"/>
+          <w:szCs w:val="22"/>
+        </w:rPr>
+        <w:t xml:space="preserve">	</w:t>
+      </w:r>
+      <w:r>
+        <w:rPr>
+          <w:sz w:val="22"/>
+          <w:szCs w:val="22"/>
+          <w:rFonts w:ascii="Arial" w:cs="Arial" w:eastAsia="Arial" w:hAnsi="Arial"/>
+        </w:rPr>
+        <w:t xml:space="preserve">34</w:t>
+      </w:r>
+    </w:p>
+    <w:p>
+      <w:pPr>
+        <w:tabs>
+          <w:tab w:val="left" w:pos="1200"/>
+          <w:tab w:val="right" w:pos="9000" w:leader="dot"/>
+        </w:tabs>
+        <w:spacing w:before="80" w:after="80"/>
+      </w:pPr>
+      <w:r>
+        <w:rPr>
+          <w:color w:val="1B9E88"/>
+          <w:sz w:val="22"/>
+          <w:szCs w:val="22"/>
+          <w:rFonts w:ascii="Arial" w:cs="Arial" w:eastAsia="Arial" w:hAnsi="Arial"/>
+        </w:rPr>
+        <w:t xml:space="preserve">Figura 15</w:t>
+      </w:r>
+      <w:r>
+        <w:rPr>
+          <w:sz w:val="22"/>
+          <w:szCs w:val="22"/>
+        </w:rPr>
+        <w:t xml:space="preserve">	</w:t>
+      </w:r>
+      <w:r>
+        <w:rPr>
+          <w:sz w:val="22"/>
+          <w:szCs w:val="22"/>
+          <w:rFonts w:ascii="Arial" w:cs="Arial" w:eastAsia="Arial" w:hAnsi="Arial"/>
+        </w:rPr>
+        <w:t xml:space="preserve">Diagrama de flujo de generación - Platform Access Generator</w:t>
+      </w:r>
+      <w:r>
+        <w:rPr>
+          <w:sz w:val="22"/>
+          <w:szCs w:val="22"/>
+        </w:rPr>
+        <w:t xml:space="preserve">	</w:t>
+      </w:r>
+      <w:r>
+        <w:rPr>
+          <w:sz w:val="22"/>
+          <w:szCs w:val="22"/>
+          <w:rFonts w:ascii="Arial" w:cs="Arial" w:eastAsia="Arial" w:hAnsi="Arial"/>
+        </w:rPr>
+        <w:t xml:space="preserve">38</w:t>
+      </w:r>
+    </w:p>
+    <w:p>
+      <w:pPr>
+        <w:spacing w:before="300" w:after="200"/>
+        <w:jc w:val="right"/>
       </w:pPr>
       <w:r>
         <w:rPr>
           <w:i/>
           <w:iCs/>
           <w:color w:val="646363"/>
-          <w:sz w:val="22"/>
-          <w:szCs w:val="22"/>
+          <w:sz w:val="20"/>
+          <w:szCs w:val="20"/>
           <w:rFonts w:ascii="Arial" w:cs="Arial" w:eastAsia="Arial" w:hAnsi="Arial"/>
         </w:rPr>
-        <w:t xml:space="preserve">Las ilustraciones serán listadas automáticamente en la versión final del documento.</w:t>
+        <w:t xml:space="preserve">Total de ilustraciones: 15</w:t>
       </w:r>
     </w:p>
     <w:p>
@@ -290,7 +1066,7 @@
         <w:rPr>
           <w:b/>
           <w:bCs/>
-          <w:color w:val="EB4335"/>
+          <w:color w:val="1B9E88"/>
           <w:sz w:val="28"/>
           <w:szCs w:val="28"/>
           <w:caps/>
@@ -301,19 +1077,555 @@
     </w:p>
     <w:p>
       <w:pPr>
-        <w:spacing w:before="200" w:after="400"/>
-        <w:jc w:val="center"/>
+        <w:pBdr>
+          <w:bottom w:val="single" w:color="1B9E88" w:sz="8" w:space="1"/>
+        </w:pBdr>
+        <w:tabs>
+          <w:tab w:val="left" w:pos="1200"/>
+          <w:tab w:val="right" w:pos="9000"/>
+        </w:tabs>
+        <w:spacing w:before="200" w:after="150"/>
+      </w:pPr>
+      <w:r>
+        <w:rPr>
+          <w:b/>
+          <w:bCs/>
+          <w:sz w:val="22"/>
+          <w:szCs w:val="22"/>
+          <w:rFonts w:ascii="Arial" w:cs="Arial" w:eastAsia="Arial" w:hAnsi="Arial"/>
+        </w:rPr>
+        <w:t xml:space="preserve">Tabla</w:t>
+      </w:r>
+      <w:r>
+        <w:rPr>
+          <w:sz w:val="22"/>
+          <w:szCs w:val="22"/>
+        </w:rPr>
+        <w:t xml:space="preserve">	</w:t>
+      </w:r>
+      <w:r>
+        <w:rPr>
+          <w:b/>
+          <w:bCs/>
+          <w:sz w:val="22"/>
+          <w:szCs w:val="22"/>
+          <w:rFonts w:ascii="Arial" w:cs="Arial" w:eastAsia="Arial" w:hAnsi="Arial"/>
+        </w:rPr>
+        <w:t xml:space="preserve">Título</w:t>
+      </w:r>
+      <w:r>
+        <w:rPr>
+          <w:sz w:val="22"/>
+          <w:szCs w:val="22"/>
+        </w:rPr>
+        <w:t xml:space="preserve">	</w:t>
+      </w:r>
+      <w:r>
+        <w:rPr>
+          <w:b/>
+          <w:bCs/>
+          <w:sz w:val="22"/>
+          <w:szCs w:val="22"/>
+          <w:rFonts w:ascii="Arial" w:cs="Arial" w:eastAsia="Arial" w:hAnsi="Arial"/>
+        </w:rPr>
+        <w:t xml:space="preserve">Pág.</w:t>
+      </w:r>
+    </w:p>
+    <w:p>
+      <w:pPr>
+        <w:tabs>
+          <w:tab w:val="left" w:pos="1200"/>
+          <w:tab w:val="right" w:pos="9000" w:leader="dot"/>
+        </w:tabs>
+        <w:spacing w:before="80" w:after="80"/>
+      </w:pPr>
+      <w:r>
+        <w:rPr>
+          <w:color w:val="1B9E88"/>
+          <w:sz w:val="22"/>
+          <w:szCs w:val="22"/>
+          <w:rFonts w:ascii="Arial" w:cs="Arial" w:eastAsia="Arial" w:hAnsi="Arial"/>
+        </w:rPr>
+        <w:t xml:space="preserve">Tabla 1</w:t>
+      </w:r>
+      <w:r>
+        <w:rPr>
+          <w:sz w:val="22"/>
+          <w:szCs w:val="22"/>
+        </w:rPr>
+        <w:t xml:space="preserve">	</w:t>
+      </w:r>
+      <w:r>
+        <w:rPr>
+          <w:sz w:val="22"/>
+          <w:szCs w:val="22"/>
+          <w:rFonts w:ascii="Arial" w:cs="Arial" w:eastAsia="Arial" w:hAnsi="Arial"/>
+        </w:rPr>
+        <w:t xml:space="preserve">Tecnologías utilizadas en los plugins</w:t>
+      </w:r>
+      <w:r>
+        <w:rPr>
+          <w:sz w:val="22"/>
+          <w:szCs w:val="22"/>
+        </w:rPr>
+        <w:t xml:space="preserve">	</w:t>
+      </w:r>
+      <w:r>
+        <w:rPr>
+          <w:sz w:val="22"/>
+          <w:szCs w:val="22"/>
+          <w:rFonts w:ascii="Arial" w:cs="Arial" w:eastAsia="Arial" w:hAnsi="Arial"/>
+        </w:rPr>
+        <w:t xml:space="preserve">7</w:t>
+      </w:r>
+    </w:p>
+    <w:p>
+      <w:pPr>
+        <w:tabs>
+          <w:tab w:val="left" w:pos="1200"/>
+          <w:tab w:val="right" w:pos="9000" w:leader="dot"/>
+        </w:tabs>
+        <w:spacing w:before="80" w:after="80"/>
+      </w:pPr>
+      <w:r>
+        <w:rPr>
+          <w:color w:val="1B9E88"/>
+          <w:sz w:val="22"/>
+          <w:szCs w:val="22"/>
+          <w:rFonts w:ascii="Arial" w:cs="Arial" w:eastAsia="Arial" w:hAnsi="Arial"/>
+        </w:rPr>
+        <w:t xml:space="preserve">Tabla 2</w:t>
+      </w:r>
+      <w:r>
+        <w:rPr>
+          <w:sz w:val="22"/>
+          <w:szCs w:val="22"/>
+        </w:rPr>
+        <w:t xml:space="preserve">	</w:t>
+      </w:r>
+      <w:r>
+        <w:rPr>
+          <w:sz w:val="22"/>
+          <w:szCs w:val="22"/>
+          <w:rFonts w:ascii="Arial" w:cs="Arial" w:eastAsia="Arial" w:hAnsi="Arial"/>
+        </w:rPr>
+        <w:t xml:space="preserve">Información de versión del plugin local_jobboard</w:t>
+      </w:r>
+      <w:r>
+        <w:rPr>
+          <w:sz w:val="22"/>
+          <w:szCs w:val="22"/>
+        </w:rPr>
+        <w:t xml:space="preserve">	</w:t>
+      </w:r>
+      <w:r>
+        <w:rPr>
+          <w:sz w:val="22"/>
+          <w:szCs w:val="22"/>
+          <w:rFonts w:ascii="Arial" w:cs="Arial" w:eastAsia="Arial" w:hAnsi="Arial"/>
+        </w:rPr>
+        <w:t xml:space="preserve">8</w:t>
+      </w:r>
+    </w:p>
+    <w:p>
+      <w:pPr>
+        <w:tabs>
+          <w:tab w:val="left" w:pos="1200"/>
+          <w:tab w:val="right" w:pos="9000" w:leader="dot"/>
+        </w:tabs>
+        <w:spacing w:before="80" w:after="80"/>
+      </w:pPr>
+      <w:r>
+        <w:rPr>
+          <w:color w:val="1B9E88"/>
+          <w:sz w:val="22"/>
+          <w:szCs w:val="22"/>
+          <w:rFonts w:ascii="Arial" w:cs="Arial" w:eastAsia="Arial" w:hAnsi="Arial"/>
+        </w:rPr>
+        <w:t xml:space="preserve">Tabla 3</w:t>
+      </w:r>
+      <w:r>
+        <w:rPr>
+          <w:sz w:val="22"/>
+          <w:szCs w:val="22"/>
+        </w:rPr>
+        <w:t xml:space="preserve">	</w:t>
+      </w:r>
+      <w:r>
+        <w:rPr>
+          <w:sz w:val="22"/>
+          <w:szCs w:val="22"/>
+          <w:rFonts w:ascii="Arial" w:cs="Arial" w:eastAsia="Arial" w:hAnsi="Arial"/>
+        </w:rPr>
+        <w:t xml:space="preserve">Resumen de tablas de base de datos</w:t>
+      </w:r>
+      <w:r>
+        <w:rPr>
+          <w:sz w:val="22"/>
+          <w:szCs w:val="22"/>
+        </w:rPr>
+        <w:t xml:space="preserve">	</w:t>
+      </w:r>
+      <w:r>
+        <w:rPr>
+          <w:sz w:val="22"/>
+          <w:szCs w:val="22"/>
+          <w:rFonts w:ascii="Arial" w:cs="Arial" w:eastAsia="Arial" w:hAnsi="Arial"/>
+        </w:rPr>
+        <w:t xml:space="preserve">11</w:t>
+      </w:r>
+    </w:p>
+    <w:p>
+      <w:pPr>
+        <w:tabs>
+          <w:tab w:val="left" w:pos="1200"/>
+          <w:tab w:val="right" w:pos="9000" w:leader="dot"/>
+        </w:tabs>
+        <w:spacing w:before="80" w:after="80"/>
+      </w:pPr>
+      <w:r>
+        <w:rPr>
+          <w:color w:val="1B9E88"/>
+          <w:sz w:val="22"/>
+          <w:szCs w:val="22"/>
+          <w:rFonts w:ascii="Arial" w:cs="Arial" w:eastAsia="Arial" w:hAnsi="Arial"/>
+        </w:rPr>
+        <w:t xml:space="preserve">Tabla 4</w:t>
+      </w:r>
+      <w:r>
+        <w:rPr>
+          <w:sz w:val="22"/>
+          <w:szCs w:val="22"/>
+        </w:rPr>
+        <w:t xml:space="preserve">	</w:t>
+      </w:r>
+      <w:r>
+        <w:rPr>
+          <w:sz w:val="22"/>
+          <w:szCs w:val="22"/>
+          <w:rFonts w:ascii="Arial" w:cs="Arial" w:eastAsia="Arial" w:hAnsi="Arial"/>
+        </w:rPr>
+        <w:t xml:space="preserve">Servicios web disponibles</w:t>
+      </w:r>
+      <w:r>
+        <w:rPr>
+          <w:sz w:val="22"/>
+          <w:szCs w:val="22"/>
+        </w:rPr>
+        <w:t xml:space="preserve">	</w:t>
+      </w:r>
+      <w:r>
+        <w:rPr>
+          <w:sz w:val="22"/>
+          <w:szCs w:val="22"/>
+          <w:rFonts w:ascii="Arial" w:cs="Arial" w:eastAsia="Arial" w:hAnsi="Arial"/>
+        </w:rPr>
+        <w:t xml:space="preserve">17</w:t>
+      </w:r>
+    </w:p>
+    <w:p>
+      <w:pPr>
+        <w:tabs>
+          <w:tab w:val="left" w:pos="1200"/>
+          <w:tab w:val="right" w:pos="9000" w:leader="dot"/>
+        </w:tabs>
+        <w:spacing w:before="80" w:after="80"/>
+      </w:pPr>
+      <w:r>
+        <w:rPr>
+          <w:color w:val="1B9E88"/>
+          <w:sz w:val="22"/>
+          <w:szCs w:val="22"/>
+          <w:rFonts w:ascii="Arial" w:cs="Arial" w:eastAsia="Arial" w:hAnsi="Arial"/>
+        </w:rPr>
+        <w:t xml:space="preserve">Tabla 5</w:t>
+      </w:r>
+      <w:r>
+        <w:rPr>
+          <w:sz w:val="22"/>
+          <w:szCs w:val="22"/>
+        </w:rPr>
+        <w:t xml:space="preserve">	</w:t>
+      </w:r>
+      <w:r>
+        <w:rPr>
+          <w:sz w:val="22"/>
+          <w:szCs w:val="22"/>
+          <w:rFonts w:ascii="Arial" w:cs="Arial" w:eastAsia="Arial" w:hAnsi="Arial"/>
+        </w:rPr>
+        <w:t xml:space="preserve">Información de versión - Platform Usage Report</w:t>
+      </w:r>
+      <w:r>
+        <w:rPr>
+          <w:sz w:val="22"/>
+          <w:szCs w:val="22"/>
+        </w:rPr>
+        <w:t xml:space="preserve">	</w:t>
+      </w:r>
+      <w:r>
+        <w:rPr>
+          <w:sz w:val="22"/>
+          <w:szCs w:val="22"/>
+          <w:rFonts w:ascii="Arial" w:cs="Arial" w:eastAsia="Arial" w:hAnsi="Arial"/>
+        </w:rPr>
+        <w:t xml:space="preserve">23</w:t>
+      </w:r>
+    </w:p>
+    <w:p>
+      <w:pPr>
+        <w:tabs>
+          <w:tab w:val="left" w:pos="1200"/>
+          <w:tab w:val="right" w:pos="9000" w:leader="dot"/>
+        </w:tabs>
+        <w:spacing w:before="80" w:after="80"/>
+      </w:pPr>
+      <w:r>
+        <w:rPr>
+          <w:color w:val="1B9E88"/>
+          <w:sz w:val="22"/>
+          <w:szCs w:val="22"/>
+          <w:rFonts w:ascii="Arial" w:cs="Arial" w:eastAsia="Arial" w:hAnsi="Arial"/>
+        </w:rPr>
+        <w:t xml:space="preserve">Tabla 6</w:t>
+      </w:r>
+      <w:r>
+        <w:rPr>
+          <w:sz w:val="22"/>
+          <w:szCs w:val="22"/>
+        </w:rPr>
+        <w:t xml:space="preserve">	</w:t>
+      </w:r>
+      <w:r>
+        <w:rPr>
+          <w:sz w:val="22"/>
+          <w:szCs w:val="22"/>
+          <w:rFonts w:ascii="Arial" w:cs="Arial" w:eastAsia="Arial" w:hAnsi="Arial"/>
+        </w:rPr>
+        <w:t xml:space="preserve">Tabla report_platform_usage_summary</w:t>
+      </w:r>
+      <w:r>
+        <w:rPr>
+          <w:sz w:val="22"/>
+          <w:szCs w:val="22"/>
+        </w:rPr>
+        <w:t xml:space="preserve">	</w:t>
+      </w:r>
+      <w:r>
+        <w:rPr>
+          <w:sz w:val="22"/>
+          <w:szCs w:val="22"/>
+          <w:rFonts w:ascii="Arial" w:cs="Arial" w:eastAsia="Arial" w:hAnsi="Arial"/>
+        </w:rPr>
+        <w:t xml:space="preserve">25</w:t>
+      </w:r>
+    </w:p>
+    <w:p>
+      <w:pPr>
+        <w:tabs>
+          <w:tab w:val="left" w:pos="1200"/>
+          <w:tab w:val="right" w:pos="9000" w:leader="dot"/>
+        </w:tabs>
+        <w:spacing w:before="80" w:after="80"/>
+      </w:pPr>
+      <w:r>
+        <w:rPr>
+          <w:color w:val="1B9E88"/>
+          <w:sz w:val="22"/>
+          <w:szCs w:val="22"/>
+          <w:rFonts w:ascii="Arial" w:cs="Arial" w:eastAsia="Arial" w:hAnsi="Arial"/>
+        </w:rPr>
+        <w:t xml:space="preserve">Tabla 7</w:t>
+      </w:r>
+      <w:r>
+        <w:rPr>
+          <w:sz w:val="22"/>
+          <w:szCs w:val="22"/>
+        </w:rPr>
+        <w:t xml:space="preserve">	</w:t>
+      </w:r>
+      <w:r>
+        <w:rPr>
+          <w:sz w:val="22"/>
+          <w:szCs w:val="22"/>
+          <w:rFonts w:ascii="Arial" w:cs="Arial" w:eastAsia="Arial" w:hAnsi="Arial"/>
+        </w:rPr>
+        <w:t xml:space="preserve">Capabilities del plugin Platform Usage Report</w:t>
+      </w:r>
+      <w:r>
+        <w:rPr>
+          <w:sz w:val="22"/>
+          <w:szCs w:val="22"/>
+        </w:rPr>
+        <w:t xml:space="preserve">	</w:t>
+      </w:r>
+      <w:r>
+        <w:rPr>
+          <w:sz w:val="22"/>
+          <w:szCs w:val="22"/>
+          <w:rFonts w:ascii="Arial" w:cs="Arial" w:eastAsia="Arial" w:hAnsi="Arial"/>
+        </w:rPr>
+        <w:t xml:space="preserve">27</w:t>
+      </w:r>
+    </w:p>
+    <w:p>
+      <w:pPr>
+        <w:tabs>
+          <w:tab w:val="left" w:pos="1200"/>
+          <w:tab w:val="right" w:pos="9000" w:leader="dot"/>
+        </w:tabs>
+        <w:spacing w:before="80" w:after="80"/>
+      </w:pPr>
+      <w:r>
+        <w:rPr>
+          <w:color w:val="1B9E88"/>
+          <w:sz w:val="22"/>
+          <w:szCs w:val="22"/>
+          <w:rFonts w:ascii="Arial" w:cs="Arial" w:eastAsia="Arial" w:hAnsi="Arial"/>
+        </w:rPr>
+        <w:t xml:space="preserve">Tabla 8</w:t>
+      </w:r>
+      <w:r>
+        <w:rPr>
+          <w:sz w:val="22"/>
+          <w:szCs w:val="22"/>
+        </w:rPr>
+        <w:t xml:space="preserve">	</w:t>
+      </w:r>
+      <w:r>
+        <w:rPr>
+          <w:sz w:val="22"/>
+          <w:szCs w:val="22"/>
+          <w:rFonts w:ascii="Arial" w:cs="Arial" w:eastAsia="Arial" w:hAnsi="Arial"/>
+        </w:rPr>
+        <w:t xml:space="preserve">Información de versión - Platform Access Generator</w:t>
+      </w:r>
+      <w:r>
+        <w:rPr>
+          <w:sz w:val="22"/>
+          <w:szCs w:val="22"/>
+        </w:rPr>
+        <w:t xml:space="preserve">	</w:t>
+      </w:r>
+      <w:r>
+        <w:rPr>
+          <w:sz w:val="22"/>
+          <w:szCs w:val="22"/>
+          <w:rFonts w:ascii="Arial" w:cs="Arial" w:eastAsia="Arial" w:hAnsi="Arial"/>
+        </w:rPr>
+        <w:t xml:space="preserve">33</w:t>
+      </w:r>
+    </w:p>
+    <w:p>
+      <w:pPr>
+        <w:tabs>
+          <w:tab w:val="left" w:pos="1200"/>
+          <w:tab w:val="right" w:pos="9000" w:leader="dot"/>
+        </w:tabs>
+        <w:spacing w:before="80" w:after="80"/>
+      </w:pPr>
+      <w:r>
+        <w:rPr>
+          <w:color w:val="1B9E88"/>
+          <w:sz w:val="22"/>
+          <w:szCs w:val="22"/>
+          <w:rFonts w:ascii="Arial" w:cs="Arial" w:eastAsia="Arial" w:hAnsi="Arial"/>
+        </w:rPr>
+        <w:t xml:space="preserve">Tabla 9</w:t>
+      </w:r>
+      <w:r>
+        <w:rPr>
+          <w:sz w:val="22"/>
+          <w:szCs w:val="22"/>
+        </w:rPr>
+        <w:t xml:space="preserve">	</w:t>
+      </w:r>
+      <w:r>
+        <w:rPr>
+          <w:sz w:val="22"/>
+          <w:szCs w:val="22"/>
+          <w:rFonts w:ascii="Arial" w:cs="Arial" w:eastAsia="Arial" w:hAnsi="Arial"/>
+        </w:rPr>
+        <w:t xml:space="preserve">Capabilities del plugin Platform Access Generator</w:t>
+      </w:r>
+      <w:r>
+        <w:rPr>
+          <w:sz w:val="22"/>
+          <w:szCs w:val="22"/>
+        </w:rPr>
+        <w:t xml:space="preserve">	</w:t>
+      </w:r>
+      <w:r>
+        <w:rPr>
+          <w:sz w:val="22"/>
+          <w:szCs w:val="22"/>
+          <w:rFonts w:ascii="Arial" w:cs="Arial" w:eastAsia="Arial" w:hAnsi="Arial"/>
+        </w:rPr>
+        <w:t xml:space="preserve">36</w:t>
+      </w:r>
+    </w:p>
+    <w:p>
+      <w:pPr>
+        <w:tabs>
+          <w:tab w:val="left" w:pos="1200"/>
+          <w:tab w:val="right" w:pos="9000" w:leader="dot"/>
+        </w:tabs>
+        <w:spacing w:before="80" w:after="80"/>
+      </w:pPr>
+      <w:r>
+        <w:rPr>
+          <w:color w:val="1B9E88"/>
+          <w:sz w:val="22"/>
+          <w:szCs w:val="22"/>
+          <w:rFonts w:ascii="Arial" w:cs="Arial" w:eastAsia="Arial" w:hAnsi="Arial"/>
+        </w:rPr>
+        <w:t xml:space="preserve">Tabla 10</w:t>
+      </w:r>
+      <w:r>
+        <w:rPr>
+          <w:sz w:val="22"/>
+          <w:szCs w:val="22"/>
+        </w:rPr>
+        <w:t xml:space="preserve">	</w:t>
+      </w:r>
+      <w:r>
+        <w:rPr>
+          <w:sz w:val="22"/>
+          <w:szCs w:val="22"/>
+          <w:rFonts w:ascii="Arial" w:cs="Arial" w:eastAsia="Arial" w:hAnsi="Arial"/>
+        </w:rPr>
+        <w:t xml:space="preserve">Técnicas de optimización implementadas</w:t>
+      </w:r>
+      <w:r>
+        <w:rPr>
+          <w:sz w:val="22"/>
+          <w:szCs w:val="22"/>
+        </w:rPr>
+        <w:t xml:space="preserve">	</w:t>
+      </w:r>
+      <w:r>
+        <w:rPr>
+          <w:sz w:val="22"/>
+          <w:szCs w:val="22"/>
+          <w:rFonts w:ascii="Arial" w:cs="Arial" w:eastAsia="Arial" w:hAnsi="Arial"/>
+        </w:rPr>
+        <w:t xml:space="preserve">39</w:t>
+      </w:r>
+    </w:p>
+    <w:p>
+      <w:pPr>
+        <w:spacing w:before="300" w:after="200"/>
+        <w:jc w:val="right"/>
       </w:pPr>
       <w:r>
         <w:rPr>
           <w:i/>
           <w:iCs/>
           <w:color w:val="646363"/>
-          <w:sz w:val="22"/>
-          <w:szCs w:val="22"/>
+          <w:sz w:val="20"/>
+          <w:szCs w:val="20"/>
           <w:rFonts w:ascii="Arial" w:cs="Arial" w:eastAsia="Arial" w:hAnsi="Arial"/>
         </w:rPr>
-        <w:t xml:space="preserve">Las tablas serán listadas automáticamente en la versión final del documento.</w:t>
+        <w:t xml:space="preserve">Total de tablas: 10</w:t>
       </w:r>
     </w:p>
     <w:p>
@@ -2899,7 +4211,7 @@
       <w:r>
         <w:drawing>
           <wp:inline distT="0" distB="0" distL="0" distR="0">
-            <wp:extent cx="4953000" cy="5229225"/>
+            <wp:extent cx="4953000" cy="5734050"/>
             <wp:effectExtent t="0" r="0" b="0" l="0"/>
             <wp:docPr id="1" name="" descr="" title=""/>
             <wp:cNvGraphicFramePr>
@@ -2924,7 +4236,7 @@
                   <pic:spPr bwMode="auto">
                     <a:xfrm>
                       <a:off x="0" y="0"/>
-                      <a:ext cx="4953000" cy="5229225"/>
+                      <a:ext cx="4953000" cy="5734050"/>
                     </a:xfrm>
                     <a:prstGeom prst="rect">
                       <a:avLst/>
@@ -16993,7 +18305,7 @@
       <w:r>
         <w:drawing>
           <wp:inline distT="0" distB="0" distL="0" distR="0">
-            <wp:extent cx="4953000" cy="3305175"/>
+            <wp:extent cx="4953000" cy="3467100"/>
             <wp:effectExtent t="0" r="0" b="0" l="0"/>
             <wp:docPr id="1" name="" descr="" title=""/>
             <wp:cNvGraphicFramePr>
@@ -17018,7 +18330,7 @@
                   <pic:spPr bwMode="auto">
                     <a:xfrm>
                       <a:off x="0" y="0"/>
-                      <a:ext cx="4953000" cy="3305175"/>
+                      <a:ext cx="4953000" cy="3467100"/>
                     </a:xfrm>
                     <a:prstGeom prst="rect">
                       <a:avLst/>

</xml_diff>

<commit_message>
feat(informe_tecnico): Add F-GCT-17 format generator with navigable TOC
- Created generate_report_fgct17.js with ISER institutional header/footer
- Implemented navigable Table of Contents using Word TOC fields
- Added navigable Table of Figures and Table of Tables
- Removed Methodology section as requested
- Fixed SVG superposition issues in flujo_acceso.svg and flujo_reporte.svg
- Updated section numbering (Alcance is now section 3, Tecnologías is section 4)
</commit_message>
<xml_diff>
--- a/docs/informe_tecnico/output/INFORME_TECNICO_PLUGINS_ISER_2025.docx
+++ b/docs/informe_tecnico/output/INFORME_TECNICO_PLUGINS_ISER_2025.docx
@@ -1991,7 +1991,7 @@
         <w:spacing w:before="400" w:after="200"/>
       </w:pPr>
       <w:r>
-        <w:t xml:space="preserve">3. METODOLOGÍA</w:t>
+        <w:t xml:space="preserve">3. ALCANCE</w:t>
       </w:r>
     </w:p>
     <w:p>
@@ -2004,21 +2004,12 @@
           <w:sz w:val="24"/>
           <w:szCs w:val="24"/>
         </w:rPr>
-        <w:t xml:space="preserve">La elaboración de este informe técnico siguió una metodología sistemática de análisis de código y documentación que garantiza la precisión y completitud de la información presentada.</w:t>
-      </w:r>
-    </w:p>
-    <w:p>
-      <w:pPr>
-        <w:pStyle w:val="Heading2"/>
-        <w:spacing w:before="300" w:after="150"/>
-      </w:pPr>
-      <w:r>
-        <w:t xml:space="preserve">3.1 Fases del Proceso</w:t>
-      </w:r>
-    </w:p>
-    <w:p>
-      <w:pPr>
-        <w:spacing w:before="200" w:after="100"/>
+        <w:t xml:space="preserve">Este documento cubre la documentación técnica de los tres plugins mencionados en su versión actual (2025). El alcance incluye:</w:t>
+      </w:r>
+    </w:p>
+    <w:p>
+      <w:pPr>
+        <w:spacing w:after="100"/>
       </w:pPr>
       <w:r>
         <w:rPr>
@@ -2028,308 +2019,6 @@
           <w:sz w:val="24"/>
           <w:szCs w:val="24"/>
         </w:rPr>
-        <w:t xml:space="preserve">Fase 1: Análisis de Código Fuente</w:t>
-      </w:r>
-    </w:p>
-    <w:p>
-      <w:pPr>
-        <w:spacing w:after="50"/>
-        <w:ind w:left="360"/>
-        <w:jc w:val="both"/>
-      </w:pPr>
-      <w:r>
-        <w:rPr>
-          <w:sz w:val="24"/>
-          <w:szCs w:val="24"/>
-        </w:rPr>
-        <w:t xml:space="preserve">Revisión sistemática de todos los archivos PHP, JavaScript, XML y CSS de cada plugin, extrayendo información sobre clases, funciones, constantes y configuraciones.</w:t>
-      </w:r>
-    </w:p>
-    <w:p>
-      <w:pPr>
-        <w:spacing w:after="100"/>
-        <w:ind w:left="360"/>
-      </w:pPr>
-      <w:r>
-        <w:rPr>
-          <w:b/>
-          <w:bCs/>
-          <w:i/>
-          <w:iCs/>
-          <w:sz w:val="22"/>
-          <w:szCs w:val="22"/>
-        </w:rPr>
-        <w:t xml:space="preserve">Herramientas: </w:t>
-      </w:r>
-      <w:r>
-        <w:rPr>
-          <w:i/>
-          <w:iCs/>
-          <w:color w:val="646363"/>
-          <w:sz w:val="22"/>
-          <w:szCs w:val="22"/>
-        </w:rPr>
-        <w:t xml:space="preserve">Análisis estático de código, parsing de archivos XML</w:t>
-      </w:r>
-    </w:p>
-    <w:p>
-      <w:pPr>
-        <w:spacing w:before="200" w:after="100"/>
-      </w:pPr>
-      <w:r>
-        <w:rPr>
-          <w:b/>
-          <w:bCs/>
-          <w:color w:val="1B9E88"/>
-          <w:sz w:val="24"/>
-          <w:szCs w:val="24"/>
-        </w:rPr>
-        <w:t xml:space="preserve">Fase 2: Extracción de Esquemas</w:t>
-      </w:r>
-    </w:p>
-    <w:p>
-      <w:pPr>
-        <w:spacing w:after="50"/>
-        <w:ind w:left="360"/>
-        <w:jc w:val="both"/>
-      </w:pPr>
-      <w:r>
-        <w:rPr>
-          <w:sz w:val="24"/>
-          <w:szCs w:val="24"/>
-        </w:rPr>
-        <w:t xml:space="preserve">Análisis de archivos install.xml y access.php para documentar la estructura de base de datos y el sistema de permisos.</w:t>
-      </w:r>
-    </w:p>
-    <w:p>
-      <w:pPr>
-        <w:spacing w:after="100"/>
-        <w:ind w:left="360"/>
-      </w:pPr>
-      <w:r>
-        <w:rPr>
-          <w:b/>
-          <w:bCs/>
-          <w:i/>
-          <w:iCs/>
-          <w:sz w:val="22"/>
-          <w:szCs w:val="22"/>
-        </w:rPr>
-        <w:t xml:space="preserve">Herramientas: </w:t>
-      </w:r>
-      <w:r>
-        <w:rPr>
-          <w:i/>
-          <w:iCs/>
-          <w:color w:val="646363"/>
-          <w:sz w:val="22"/>
-          <w:szCs w:val="22"/>
-        </w:rPr>
-        <w:t xml:space="preserve">Parsing XML, análisis de definiciones de capabilities</w:t>
-      </w:r>
-    </w:p>
-    <w:p>
-      <w:pPr>
-        <w:spacing w:before="200" w:after="100"/>
-      </w:pPr>
-      <w:r>
-        <w:rPr>
-          <w:b/>
-          <w:bCs/>
-          <w:color w:val="1B9E88"/>
-          <w:sz w:val="24"/>
-          <w:szCs w:val="24"/>
-        </w:rPr>
-        <w:t xml:space="preserve">Fase 3: Generación de Diagramas</w:t>
-      </w:r>
-    </w:p>
-    <w:p>
-      <w:pPr>
-        <w:spacing w:after="50"/>
-        <w:ind w:left="360"/>
-        <w:jc w:val="both"/>
-      </w:pPr>
-      <w:r>
-        <w:rPr>
-          <w:sz w:val="24"/>
-          <w:szCs w:val="24"/>
-        </w:rPr>
-        <w:t xml:space="preserve">Creación de diagramas técnicos en formato SVG que ilustran la arquitectura, flujos de trabajo y relaciones entre componentes.</w:t>
-      </w:r>
-    </w:p>
-    <w:p>
-      <w:pPr>
-        <w:spacing w:after="100"/>
-        <w:ind w:left="360"/>
-      </w:pPr>
-      <w:r>
-        <w:rPr>
-          <w:b/>
-          <w:bCs/>
-          <w:i/>
-          <w:iCs/>
-          <w:sz w:val="22"/>
-          <w:szCs w:val="22"/>
-        </w:rPr>
-        <w:t xml:space="preserve">Herramientas: </w:t>
-      </w:r>
-      <w:r>
-        <w:rPr>
-          <w:i/>
-          <w:iCs/>
-          <w:color w:val="646363"/>
-          <w:sz w:val="22"/>
-          <w:szCs w:val="22"/>
-        </w:rPr>
-        <w:t xml:space="preserve">Diseño vectorial SVG con colores corporativos ISER</w:t>
-      </w:r>
-    </w:p>
-    <w:p>
-      <w:pPr>
-        <w:spacing w:before="200" w:after="100"/>
-      </w:pPr>
-      <w:r>
-        <w:rPr>
-          <w:b/>
-          <w:bCs/>
-          <w:color w:val="1B9E88"/>
-          <w:sz w:val="24"/>
-          <w:szCs w:val="24"/>
-        </w:rPr>
-        <w:t xml:space="preserve">Fase 4: Consolidación de Datos</w:t>
-      </w:r>
-    </w:p>
-    <w:p>
-      <w:pPr>
-        <w:spacing w:after="50"/>
-        <w:ind w:left="360"/>
-        <w:jc w:val="both"/>
-      </w:pPr>
-      <w:r>
-        <w:rPr>
-          <w:sz w:val="24"/>
-          <w:szCs w:val="24"/>
-        </w:rPr>
-        <w:t xml:space="preserve">Integración de toda la información extraída en estructuras JSON que sirven como fuente de datos para el documento.</w:t>
-      </w:r>
-    </w:p>
-    <w:p>
-      <w:pPr>
-        <w:spacing w:after="100"/>
-        <w:ind w:left="360"/>
-      </w:pPr>
-      <w:r>
-        <w:rPr>
-          <w:b/>
-          <w:bCs/>
-          <w:i/>
-          <w:iCs/>
-          <w:sz w:val="22"/>
-          <w:szCs w:val="22"/>
-        </w:rPr>
-        <w:t xml:space="preserve">Herramientas: </w:t>
-      </w:r>
-      <w:r>
-        <w:rPr>
-          <w:i/>
-          <w:iCs/>
-          <w:color w:val="646363"/>
-          <w:sz w:val="22"/>
-          <w:szCs w:val="22"/>
-        </w:rPr>
-        <w:t xml:space="preserve">Procesamiento JSON, validación de datos</w:t>
-      </w:r>
-    </w:p>
-    <w:p>
-      <w:pPr>
-        <w:spacing w:before="200" w:after="100"/>
-      </w:pPr>
-      <w:r>
-        <w:rPr>
-          <w:b/>
-          <w:bCs/>
-          <w:color w:val="1B9E88"/>
-          <w:sz w:val="24"/>
-          <w:szCs w:val="24"/>
-        </w:rPr>
-        <w:t xml:space="preserve">Fase 5: Generación del Documento</w:t>
-      </w:r>
-    </w:p>
-    <w:p>
-      <w:pPr>
-        <w:spacing w:after="50"/>
-        <w:ind w:left="360"/>
-        <w:jc w:val="both"/>
-      </w:pPr>
-      <w:r>
-        <w:rPr>
-          <w:sz w:val="24"/>
-          <w:szCs w:val="24"/>
-        </w:rPr>
-        <w:t xml:space="preserve">Producción automatizada del documento Word (.docx) utilizando plantillas y estilos ICONTEC.</w:t>
-      </w:r>
-    </w:p>
-    <w:p>
-      <w:pPr>
-        <w:spacing w:after="100"/>
-        <w:ind w:left="360"/>
-      </w:pPr>
-      <w:r>
-        <w:rPr>
-          <w:b/>
-          <w:bCs/>
-          <w:i/>
-          <w:iCs/>
-          <w:sz w:val="22"/>
-          <w:szCs w:val="22"/>
-        </w:rPr>
-        <w:t xml:space="preserve">Herramientas: </w:t>
-      </w:r>
-      <w:r>
-        <w:rPr>
-          <w:i/>
-          <w:iCs/>
-          <w:color w:val="646363"/>
-          <w:sz w:val="22"/>
-          <w:szCs w:val="22"/>
-        </w:rPr>
-        <w:t xml:space="preserve">Librería docx para Node.js, Sharp para procesamiento de imágenes</w:t>
-      </w:r>
-    </w:p>
-    <w:p>
-      <w:pPr>
-        <w:pStyle w:val="Heading1"/>
-        <w:spacing w:before="400" w:after="200"/>
-      </w:pPr>
-      <w:r>
-        <w:t xml:space="preserve">4. ALCANCE</w:t>
-      </w:r>
-    </w:p>
-    <w:p>
-      <w:pPr>
-        <w:spacing w:after="200"/>
-        <w:jc w:val="both"/>
-      </w:pPr>
-      <w:r>
-        <w:rPr>
-          <w:sz w:val="24"/>
-          <w:szCs w:val="24"/>
-        </w:rPr>
-        <w:t xml:space="preserve">Este documento cubre la documentación técnica de los tres plugins mencionados en su versión actual (2025). El alcance incluye:</w:t>
-      </w:r>
-    </w:p>
-    <w:p>
-      <w:pPr>
-        <w:spacing w:after="100"/>
-      </w:pPr>
-      <w:r>
-        <w:rPr>
-          <w:b/>
-          <w:bCs/>
-          <w:color w:val="1B9E88"/>
-          <w:sz w:val="24"/>
-          <w:szCs w:val="24"/>
-        </w:rPr>
         <w:t xml:space="preserve">Incluye:</w:t>
       </w:r>
     </w:p>
@@ -2497,7 +2186,7 @@
         <w:spacing w:before="400" w:after="200"/>
       </w:pPr>
       <w:r>
-        <w:t xml:space="preserve">5. TECNOLOGÍAS UTILIZADAS</w:t>
+        <w:t xml:space="preserve">4. TECNOLOGÍAS UTILIZADAS</w:t>
       </w:r>
     </w:p>
     <w:p>

</xml_diff>